<commit_message>
Fix issue with dates
</commit_message>
<xml_diff>
--- a/02 - Student Pre Post Retrospective/02_Student_Pre_Post_Retrospective.docx
+++ b/02 - Student Pre Post Retrospective/02_Student_Pre_Post_Retrospective.docx
@@ -40,6 +40,17 @@
     </w:p>
     <w:bookmarkEnd w:id="20"/>
     <w:bookmarkEnd w:id="21"/>
+    <w:p>
+      <w:pPr>
+        <w:pStyle w:val="SourceCode"/>
+      </w:pPr>
+      <w:r>
+        <w:rPr>
+          <w:rStyle w:val="VerbatimChar"/>
+        </w:rPr>
+        <w:t xml:space="preserve">## Warning: package 'surveydown' was built under R version 4.6.1</w:t>
+      </w:r>
+    </w:p>
     <w:p>
       <w:pPr>
         <w:pStyle w:val="FirstParagraph"/>
@@ -607,7 +618,7 @@
     </w:p>
     <w:bookmarkEnd w:id="33"/>
     <w:bookmarkEnd w:id="34"/>
-    <w:bookmarkStart w:id="42" w:name="about-your-institution-and-module"/>
+    <w:bookmarkStart w:id="40" w:name="about-your-institution-and-module"/>
     <w:p>
       <w:pPr>
         <w:pStyle w:val="Heading1"/>
@@ -802,17 +813,103 @@
       </w:r>
     </w:p>
     <w:bookmarkEnd w:id="39"/>
-    <w:bookmarkStart w:id="41" w:name="container-module_completion_date"/>
-    <w:bookmarkStart w:id="40" w:name="module_completion_date"/>
-    <w:p>
-      <w:pPr>
-        <w:pStyle w:val="BodyText"/>
-      </w:pPr>
-      <w:r>
-        <w:t xml:space="preserve">What date did you complete your AI-GENe module?</w:t>
+    <w:p>
+      <w:pPr>
+        <w:pStyle w:val="BodyText"/>
+      </w:pPr>
+      <w:r>
+        <w:br/>
+      </w:r>
+    </w:p>
+    <w:p>
+      <w:pPr>
+        <w:pStyle w:val="BodyText"/>
+      </w:pPr>
+      <w:r>
+        <w:t xml:space="preserve">— reflection1</w:t>
       </w:r>
     </w:p>
     <w:bookmarkEnd w:id="40"/>
+    <w:bookmarkStart w:id="70" w:name="reflecting-on-your-experience"/>
+    <w:p>
+      <w:pPr>
+        <w:pStyle w:val="Heading1"/>
+      </w:pPr>
+      <w:r>
+        <w:t xml:space="preserve">Reflecting on your experience</w:t>
+      </w:r>
+    </w:p>
+    <w:p>
+      <w:pPr>
+        <w:pStyle w:val="FirstParagraph"/>
+      </w:pPr>
+      <w:r>
+        <w:t xml:space="preserve">These questions are intended to help you reflect on your experience</w:t>
+      </w:r>
+      <w:r>
+        <w:t xml:space="preserve"> </w:t>
+      </w:r>
+      <w:r>
+        <w:t xml:space="preserve">working through the AI-GENe modules. Please rate how much you agree with</w:t>
+      </w:r>
+      <w:r>
+        <w:t xml:space="preserve"> </w:t>
+      </w:r>
+      <w:r>
+        <w:t xml:space="preserve">each statement.</w:t>
+      </w:r>
+    </w:p>
+    <w:bookmarkStart w:id="42" w:name="container-lab_skills"/>
+    <w:bookmarkStart w:id="41" w:name="lab_skills"/>
+    <w:p>
+      <w:pPr>
+        <w:pStyle w:val="BodyText"/>
+      </w:pPr>
+      <w:r>
+        <w:t xml:space="preserve">After completing the activity, my skills and comfort with genetics lab work have improved.</w:t>
+      </w:r>
+    </w:p>
+    <w:p>
+      <w:pPr>
+        <w:pStyle w:val="BodyText"/>
+      </w:pPr>
+      <w:r>
+        <w:t xml:space="preserve">Not at all (1)</w:t>
+      </w:r>
+    </w:p>
+    <w:p>
+      <w:pPr>
+        <w:pStyle w:val="BodyText"/>
+      </w:pPr>
+      <w:r>
+        <w:t xml:space="preserve">Slightly (2)</w:t>
+      </w:r>
+    </w:p>
+    <w:p>
+      <w:pPr>
+        <w:pStyle w:val="BodyText"/>
+      </w:pPr>
+      <w:r>
+        <w:t xml:space="preserve">Moderately (3)</w:t>
+      </w:r>
+    </w:p>
+    <w:p>
+      <w:pPr>
+        <w:pStyle w:val="BodyText"/>
+      </w:pPr>
+      <w:r>
+        <w:t xml:space="preserve">Quite a bit (4)</w:t>
+      </w:r>
+    </w:p>
+    <w:p>
+      <w:pPr>
+        <w:pStyle w:val="BodyText"/>
+      </w:pPr>
+      <w:r>
+        <w:t xml:space="preserve">Very much (5)</w:t>
+      </w:r>
+    </w:p>
+    <w:bookmarkEnd w:id="41"/>
     <w:p>
       <w:pPr>
         <w:pStyle w:val="BodyText"/>
@@ -821,7 +918,805 @@
         <w:t xml:space="preserve">*</w:t>
       </w:r>
     </w:p>
-    <w:bookmarkEnd w:id="41"/>
+    <w:bookmarkEnd w:id="42"/>
+    <w:bookmarkStart w:id="44" w:name="container-data_analysis_skills"/>
+    <w:bookmarkStart w:id="43" w:name="data_analysis_skills"/>
+    <w:p>
+      <w:pPr>
+        <w:pStyle w:val="BodyText"/>
+      </w:pPr>
+      <w:r>
+        <w:t xml:space="preserve">After completing the activity, my skills and comfort with analyzing genetic data have improved.</w:t>
+      </w:r>
+    </w:p>
+    <w:p>
+      <w:pPr>
+        <w:pStyle w:val="BodyText"/>
+      </w:pPr>
+      <w:r>
+        <w:t xml:space="preserve">Not at all (1)</w:t>
+      </w:r>
+    </w:p>
+    <w:p>
+      <w:pPr>
+        <w:pStyle w:val="BodyText"/>
+      </w:pPr>
+      <w:r>
+        <w:t xml:space="preserve">Slightly (2)</w:t>
+      </w:r>
+    </w:p>
+    <w:p>
+      <w:pPr>
+        <w:pStyle w:val="BodyText"/>
+      </w:pPr>
+      <w:r>
+        <w:t xml:space="preserve">Moderately (3)</w:t>
+      </w:r>
+    </w:p>
+    <w:p>
+      <w:pPr>
+        <w:pStyle w:val="BodyText"/>
+      </w:pPr>
+      <w:r>
+        <w:t xml:space="preserve">Quite a bit (4)</w:t>
+      </w:r>
+    </w:p>
+    <w:p>
+      <w:pPr>
+        <w:pStyle w:val="BodyText"/>
+      </w:pPr>
+      <w:r>
+        <w:t xml:space="preserve">Very much (5)</w:t>
+      </w:r>
+    </w:p>
+    <w:bookmarkEnd w:id="43"/>
+    <w:p>
+      <w:pPr>
+        <w:pStyle w:val="BodyText"/>
+      </w:pPr>
+      <w:r>
+        <w:t xml:space="preserve">*</w:t>
+      </w:r>
+    </w:p>
+    <w:bookmarkEnd w:id="44"/>
+    <w:bookmarkStart w:id="46" w:name="container-genomics_tools"/>
+    <w:bookmarkStart w:id="45" w:name="genomics_tools"/>
+    <w:p>
+      <w:pPr>
+        <w:pStyle w:val="BodyText"/>
+      </w:pPr>
+      <w:r>
+        <w:t xml:space="preserve">After completing the activity, my skills and comfort with using genomics tools and/or websites have improved.</w:t>
+      </w:r>
+    </w:p>
+    <w:p>
+      <w:pPr>
+        <w:pStyle w:val="BodyText"/>
+      </w:pPr>
+      <w:r>
+        <w:t xml:space="preserve">Not at all (1)</w:t>
+      </w:r>
+    </w:p>
+    <w:p>
+      <w:pPr>
+        <w:pStyle w:val="BodyText"/>
+      </w:pPr>
+      <w:r>
+        <w:t xml:space="preserve">Slightly (2)</w:t>
+      </w:r>
+    </w:p>
+    <w:p>
+      <w:pPr>
+        <w:pStyle w:val="BodyText"/>
+      </w:pPr>
+      <w:r>
+        <w:t xml:space="preserve">Moderately (3)</w:t>
+      </w:r>
+    </w:p>
+    <w:p>
+      <w:pPr>
+        <w:pStyle w:val="BodyText"/>
+      </w:pPr>
+      <w:r>
+        <w:t xml:space="preserve">Quite a bit (4)</w:t>
+      </w:r>
+    </w:p>
+    <w:p>
+      <w:pPr>
+        <w:pStyle w:val="BodyText"/>
+      </w:pPr>
+      <w:r>
+        <w:t xml:space="preserve">Very much (5)</w:t>
+      </w:r>
+    </w:p>
+    <w:bookmarkEnd w:id="45"/>
+    <w:p>
+      <w:pPr>
+        <w:pStyle w:val="BodyText"/>
+      </w:pPr>
+      <w:r>
+        <w:t xml:space="preserve">*</w:t>
+      </w:r>
+    </w:p>
+    <w:bookmarkEnd w:id="46"/>
+    <w:bookmarkStart w:id="48" w:name="container-ai_tools"/>
+    <w:bookmarkStart w:id="47" w:name="ai_tools"/>
+    <w:p>
+      <w:pPr>
+        <w:pStyle w:val="BodyText"/>
+      </w:pPr>
+      <w:r>
+        <w:t xml:space="preserve">After completing the activity, my skills and comfort with using AI-based tools for genetics work have improved.</w:t>
+      </w:r>
+    </w:p>
+    <w:p>
+      <w:pPr>
+        <w:pStyle w:val="BodyText"/>
+      </w:pPr>
+      <w:r>
+        <w:t xml:space="preserve">Not at all (1)</w:t>
+      </w:r>
+    </w:p>
+    <w:p>
+      <w:pPr>
+        <w:pStyle w:val="BodyText"/>
+      </w:pPr>
+      <w:r>
+        <w:t xml:space="preserve">Slightly (2)</w:t>
+      </w:r>
+    </w:p>
+    <w:p>
+      <w:pPr>
+        <w:pStyle w:val="BodyText"/>
+      </w:pPr>
+      <w:r>
+        <w:t xml:space="preserve">Moderately (3)</w:t>
+      </w:r>
+    </w:p>
+    <w:p>
+      <w:pPr>
+        <w:pStyle w:val="BodyText"/>
+      </w:pPr>
+      <w:r>
+        <w:t xml:space="preserve">Quite a bit (4)</w:t>
+      </w:r>
+    </w:p>
+    <w:p>
+      <w:pPr>
+        <w:pStyle w:val="BodyText"/>
+      </w:pPr>
+      <w:r>
+        <w:t xml:space="preserve">Very much (5)</w:t>
+      </w:r>
+    </w:p>
+    <w:bookmarkEnd w:id="47"/>
+    <w:p>
+      <w:pPr>
+        <w:pStyle w:val="BodyText"/>
+      </w:pPr>
+      <w:r>
+        <w:t xml:space="preserve">*</w:t>
+      </w:r>
+    </w:p>
+    <w:bookmarkEnd w:id="48"/>
+    <w:bookmarkStart w:id="50" w:name="container-apply_skills"/>
+    <w:bookmarkStart w:id="49" w:name="apply_skills"/>
+    <w:p>
+      <w:pPr>
+        <w:pStyle w:val="BodyText"/>
+      </w:pPr>
+      <w:r>
+        <w:t xml:space="preserve">This activity made me apply my skills, rather than recall facts.</w:t>
+      </w:r>
+    </w:p>
+    <w:p>
+      <w:pPr>
+        <w:pStyle w:val="BodyText"/>
+      </w:pPr>
+      <w:r>
+        <w:t xml:space="preserve">Not at all (1)</w:t>
+      </w:r>
+    </w:p>
+    <w:p>
+      <w:pPr>
+        <w:pStyle w:val="BodyText"/>
+      </w:pPr>
+      <w:r>
+        <w:t xml:space="preserve">Slightly (2)</w:t>
+      </w:r>
+    </w:p>
+    <w:p>
+      <w:pPr>
+        <w:pStyle w:val="BodyText"/>
+      </w:pPr>
+      <w:r>
+        <w:t xml:space="preserve">Moderately (3)</w:t>
+      </w:r>
+    </w:p>
+    <w:p>
+      <w:pPr>
+        <w:pStyle w:val="BodyText"/>
+      </w:pPr>
+      <w:r>
+        <w:t xml:space="preserve">Quite a bit (4)</w:t>
+      </w:r>
+    </w:p>
+    <w:p>
+      <w:pPr>
+        <w:pStyle w:val="BodyText"/>
+      </w:pPr>
+      <w:r>
+        <w:t xml:space="preserve">Very much (5)</w:t>
+      </w:r>
+    </w:p>
+    <w:bookmarkEnd w:id="49"/>
+    <w:p>
+      <w:pPr>
+        <w:pStyle w:val="BodyText"/>
+      </w:pPr>
+      <w:r>
+        <w:t xml:space="preserve">*</w:t>
+      </w:r>
+    </w:p>
+    <w:bookmarkEnd w:id="50"/>
+    <w:bookmarkStart w:id="52" w:name="container-evaluate_evidence"/>
+    <w:bookmarkStart w:id="51" w:name="evaluate_evidence"/>
+    <w:p>
+      <w:pPr>
+        <w:pStyle w:val="BodyText"/>
+      </w:pPr>
+      <w:r>
+        <w:t xml:space="preserve">This activity made me evaluate evidence, rather than recall facts.</w:t>
+      </w:r>
+    </w:p>
+    <w:p>
+      <w:pPr>
+        <w:pStyle w:val="BodyText"/>
+      </w:pPr>
+      <w:r>
+        <w:t xml:space="preserve">Not at all (1)</w:t>
+      </w:r>
+    </w:p>
+    <w:p>
+      <w:pPr>
+        <w:pStyle w:val="BodyText"/>
+      </w:pPr>
+      <w:r>
+        <w:t xml:space="preserve">Slightly (2)</w:t>
+      </w:r>
+    </w:p>
+    <w:p>
+      <w:pPr>
+        <w:pStyle w:val="BodyText"/>
+      </w:pPr>
+      <w:r>
+        <w:t xml:space="preserve">Moderately (3)</w:t>
+      </w:r>
+    </w:p>
+    <w:p>
+      <w:pPr>
+        <w:pStyle w:val="BodyText"/>
+      </w:pPr>
+      <w:r>
+        <w:t xml:space="preserve">Quite a bit (4)</w:t>
+      </w:r>
+    </w:p>
+    <w:p>
+      <w:pPr>
+        <w:pStyle w:val="BodyText"/>
+      </w:pPr>
+      <w:r>
+        <w:t xml:space="preserve">Very much (5)</w:t>
+      </w:r>
+    </w:p>
+    <w:bookmarkEnd w:id="51"/>
+    <w:p>
+      <w:pPr>
+        <w:pStyle w:val="BodyText"/>
+      </w:pPr>
+      <w:r>
+        <w:t xml:space="preserve">*</w:t>
+      </w:r>
+    </w:p>
+    <w:bookmarkEnd w:id="52"/>
+    <w:bookmarkStart w:id="54" w:name="container-draw_conclusions"/>
+    <w:bookmarkStart w:id="53" w:name="draw_conclusions"/>
+    <w:p>
+      <w:pPr>
+        <w:pStyle w:val="BodyText"/>
+      </w:pPr>
+      <w:r>
+        <w:t xml:space="preserve">This activity helped me draw conclusions from data.</w:t>
+      </w:r>
+    </w:p>
+    <w:p>
+      <w:pPr>
+        <w:pStyle w:val="BodyText"/>
+      </w:pPr>
+      <w:r>
+        <w:t xml:space="preserve">Not at all (1)</w:t>
+      </w:r>
+    </w:p>
+    <w:p>
+      <w:pPr>
+        <w:pStyle w:val="BodyText"/>
+      </w:pPr>
+      <w:r>
+        <w:t xml:space="preserve">Slightly (2)</w:t>
+      </w:r>
+    </w:p>
+    <w:p>
+      <w:pPr>
+        <w:pStyle w:val="BodyText"/>
+      </w:pPr>
+      <w:r>
+        <w:t xml:space="preserve">Moderately (3)</w:t>
+      </w:r>
+    </w:p>
+    <w:p>
+      <w:pPr>
+        <w:pStyle w:val="BodyText"/>
+      </w:pPr>
+      <w:r>
+        <w:t xml:space="preserve">Quite a bit (4)</w:t>
+      </w:r>
+    </w:p>
+    <w:p>
+      <w:pPr>
+        <w:pStyle w:val="BodyText"/>
+      </w:pPr>
+      <w:r>
+        <w:t xml:space="preserve">Very much (5)</w:t>
+      </w:r>
+    </w:p>
+    <w:bookmarkEnd w:id="53"/>
+    <w:p>
+      <w:pPr>
+        <w:pStyle w:val="BodyText"/>
+      </w:pPr>
+      <w:r>
+        <w:t xml:space="preserve">*</w:t>
+      </w:r>
+    </w:p>
+    <w:bookmarkEnd w:id="54"/>
+    <w:bookmarkStart w:id="56" w:name="container-real_science"/>
+    <w:bookmarkStart w:id="55" w:name="real_science"/>
+    <w:p>
+      <w:pPr>
+        <w:pStyle w:val="BodyText"/>
+      </w:pPr>
+      <w:r>
+        <w:t xml:space="preserve">This activity allowed me to do “real science.”</w:t>
+      </w:r>
+    </w:p>
+    <w:p>
+      <w:pPr>
+        <w:pStyle w:val="BodyText"/>
+      </w:pPr>
+      <w:r>
+        <w:t xml:space="preserve">Not at all (1)</w:t>
+      </w:r>
+    </w:p>
+    <w:p>
+      <w:pPr>
+        <w:pStyle w:val="BodyText"/>
+      </w:pPr>
+      <w:r>
+        <w:t xml:space="preserve">Slightly (2)</w:t>
+      </w:r>
+    </w:p>
+    <w:p>
+      <w:pPr>
+        <w:pStyle w:val="BodyText"/>
+      </w:pPr>
+      <w:r>
+        <w:t xml:space="preserve">Moderately (3)</w:t>
+      </w:r>
+    </w:p>
+    <w:p>
+      <w:pPr>
+        <w:pStyle w:val="BodyText"/>
+      </w:pPr>
+      <w:r>
+        <w:t xml:space="preserve">Quite a bit (4)</w:t>
+      </w:r>
+    </w:p>
+    <w:p>
+      <w:pPr>
+        <w:pStyle w:val="BodyText"/>
+      </w:pPr>
+      <w:r>
+        <w:t xml:space="preserve">Very much (5)</w:t>
+      </w:r>
+    </w:p>
+    <w:bookmarkEnd w:id="55"/>
+    <w:p>
+      <w:pPr>
+        <w:pStyle w:val="BodyText"/>
+      </w:pPr>
+      <w:r>
+        <w:t xml:space="preserve">*</w:t>
+      </w:r>
+    </w:p>
+    <w:bookmarkEnd w:id="56"/>
+    <w:bookmarkStart w:id="58" w:name="container-stem_interest"/>
+    <w:bookmarkStart w:id="57" w:name="stem_interest"/>
+    <w:p>
+      <w:pPr>
+        <w:pStyle w:val="BodyText"/>
+      </w:pPr>
+      <w:r>
+        <w:t xml:space="preserve">After completing the activity, I have more interest in STEM careers.</w:t>
+      </w:r>
+    </w:p>
+    <w:p>
+      <w:pPr>
+        <w:pStyle w:val="BodyText"/>
+      </w:pPr>
+      <w:r>
+        <w:t xml:space="preserve">Not at all (1)</w:t>
+      </w:r>
+    </w:p>
+    <w:p>
+      <w:pPr>
+        <w:pStyle w:val="BodyText"/>
+      </w:pPr>
+      <w:r>
+        <w:t xml:space="preserve">Slightly (2)</w:t>
+      </w:r>
+    </w:p>
+    <w:p>
+      <w:pPr>
+        <w:pStyle w:val="BodyText"/>
+      </w:pPr>
+      <w:r>
+        <w:t xml:space="preserve">Moderately (3)</w:t>
+      </w:r>
+    </w:p>
+    <w:p>
+      <w:pPr>
+        <w:pStyle w:val="BodyText"/>
+      </w:pPr>
+      <w:r>
+        <w:t xml:space="preserve">Quite a bit (4)</w:t>
+      </w:r>
+    </w:p>
+    <w:p>
+      <w:pPr>
+        <w:pStyle w:val="BodyText"/>
+      </w:pPr>
+      <w:r>
+        <w:t xml:space="preserve">Very much (5)</w:t>
+      </w:r>
+    </w:p>
+    <w:bookmarkEnd w:id="57"/>
+    <w:p>
+      <w:pPr>
+        <w:pStyle w:val="BodyText"/>
+      </w:pPr>
+      <w:r>
+        <w:t xml:space="preserve">*</w:t>
+      </w:r>
+    </w:p>
+    <w:bookmarkEnd w:id="58"/>
+    <w:bookmarkStart w:id="60" w:name="container-metagenomics_knowledge"/>
+    <w:bookmarkStart w:id="59" w:name="metagenomics_knowledge"/>
+    <w:p>
+      <w:pPr>
+        <w:pStyle w:val="BodyText"/>
+      </w:pPr>
+      <w:r>
+        <w:t xml:space="preserve">After completing the activity, I am more knowledgeable about how metagenomics research happens.</w:t>
+      </w:r>
+    </w:p>
+    <w:p>
+      <w:pPr>
+        <w:pStyle w:val="BodyText"/>
+      </w:pPr>
+      <w:r>
+        <w:t xml:space="preserve">Not at all (1)</w:t>
+      </w:r>
+    </w:p>
+    <w:p>
+      <w:pPr>
+        <w:pStyle w:val="BodyText"/>
+      </w:pPr>
+      <w:r>
+        <w:t xml:space="preserve">Slightly (2)</w:t>
+      </w:r>
+    </w:p>
+    <w:p>
+      <w:pPr>
+        <w:pStyle w:val="BodyText"/>
+      </w:pPr>
+      <w:r>
+        <w:t xml:space="preserve">Moderately (3)</w:t>
+      </w:r>
+    </w:p>
+    <w:p>
+      <w:pPr>
+        <w:pStyle w:val="BodyText"/>
+      </w:pPr>
+      <w:r>
+        <w:t xml:space="preserve">Quite a bit (4)</w:t>
+      </w:r>
+    </w:p>
+    <w:p>
+      <w:pPr>
+        <w:pStyle w:val="BodyText"/>
+      </w:pPr>
+      <w:r>
+        <w:t xml:space="preserve">Very much (5)</w:t>
+      </w:r>
+    </w:p>
+    <w:bookmarkEnd w:id="59"/>
+    <w:p>
+      <w:pPr>
+        <w:pStyle w:val="BodyText"/>
+      </w:pPr>
+      <w:r>
+        <w:t xml:space="preserve">*</w:t>
+      </w:r>
+    </w:p>
+    <w:bookmarkEnd w:id="60"/>
+    <w:bookmarkStart w:id="62" w:name="container-ai_models_knowledge"/>
+    <w:bookmarkStart w:id="61" w:name="ai_models_knowledge"/>
+    <w:p>
+      <w:pPr>
+        <w:pStyle w:val="BodyText"/>
+      </w:pPr>
+      <w:r>
+        <w:t xml:space="preserve">After completing the activity, I am more knowledgeable about how AI models work.</w:t>
+      </w:r>
+    </w:p>
+    <w:p>
+      <w:pPr>
+        <w:pStyle w:val="BodyText"/>
+      </w:pPr>
+      <w:r>
+        <w:t xml:space="preserve">Not at all (1)</w:t>
+      </w:r>
+    </w:p>
+    <w:p>
+      <w:pPr>
+        <w:pStyle w:val="BodyText"/>
+      </w:pPr>
+      <w:r>
+        <w:t xml:space="preserve">Slightly (2)</w:t>
+      </w:r>
+    </w:p>
+    <w:p>
+      <w:pPr>
+        <w:pStyle w:val="BodyText"/>
+      </w:pPr>
+      <w:r>
+        <w:t xml:space="preserve">Moderately (3)</w:t>
+      </w:r>
+    </w:p>
+    <w:p>
+      <w:pPr>
+        <w:pStyle w:val="BodyText"/>
+      </w:pPr>
+      <w:r>
+        <w:t xml:space="preserve">Quite a bit (4)</w:t>
+      </w:r>
+    </w:p>
+    <w:p>
+      <w:pPr>
+        <w:pStyle w:val="BodyText"/>
+      </w:pPr>
+      <w:r>
+        <w:t xml:space="preserve">Very much (5)</w:t>
+      </w:r>
+    </w:p>
+    <w:bookmarkEnd w:id="61"/>
+    <w:p>
+      <w:pPr>
+        <w:pStyle w:val="BodyText"/>
+      </w:pPr>
+      <w:r>
+        <w:t xml:space="preserve">*</w:t>
+      </w:r>
+    </w:p>
+    <w:bookmarkEnd w:id="62"/>
+    <w:bookmarkStart w:id="64" w:name="container-genomics_curiosity"/>
+    <w:bookmarkStart w:id="63" w:name="genomics_curiosity"/>
+    <w:p>
+      <w:pPr>
+        <w:pStyle w:val="BodyText"/>
+      </w:pPr>
+      <w:r>
+        <w:t xml:space="preserve">After completing the activity, I am more curious about genomics/metagenomics/genetics.</w:t>
+      </w:r>
+    </w:p>
+    <w:p>
+      <w:pPr>
+        <w:pStyle w:val="BodyText"/>
+      </w:pPr>
+      <w:r>
+        <w:t xml:space="preserve">Not at all (1)</w:t>
+      </w:r>
+    </w:p>
+    <w:p>
+      <w:pPr>
+        <w:pStyle w:val="BodyText"/>
+      </w:pPr>
+      <w:r>
+        <w:t xml:space="preserve">Slightly (2)</w:t>
+      </w:r>
+    </w:p>
+    <w:p>
+      <w:pPr>
+        <w:pStyle w:val="BodyText"/>
+      </w:pPr>
+      <w:r>
+        <w:t xml:space="preserve">Moderately (3)</w:t>
+      </w:r>
+    </w:p>
+    <w:p>
+      <w:pPr>
+        <w:pStyle w:val="BodyText"/>
+      </w:pPr>
+      <w:r>
+        <w:t xml:space="preserve">Quite a bit (4)</w:t>
+      </w:r>
+    </w:p>
+    <w:p>
+      <w:pPr>
+        <w:pStyle w:val="BodyText"/>
+      </w:pPr>
+      <w:r>
+        <w:t xml:space="preserve">Very much (5)</w:t>
+      </w:r>
+    </w:p>
+    <w:bookmarkEnd w:id="63"/>
+    <w:p>
+      <w:pPr>
+        <w:pStyle w:val="BodyText"/>
+      </w:pPr>
+      <w:r>
+        <w:t xml:space="preserve">*</w:t>
+      </w:r>
+    </w:p>
+    <w:bookmarkEnd w:id="64"/>
+    <w:bookmarkStart w:id="66" w:name="container-learn_more_genomics"/>
+    <w:bookmarkStart w:id="65" w:name="learn_more_genomics"/>
+    <w:p>
+      <w:pPr>
+        <w:pStyle w:val="BodyText"/>
+      </w:pPr>
+      <w:r>
+        <w:t xml:space="preserve">After completing the activity, I want to learn more about genomics/genetics.</w:t>
+      </w:r>
+    </w:p>
+    <w:p>
+      <w:pPr>
+        <w:pStyle w:val="BodyText"/>
+      </w:pPr>
+      <w:r>
+        <w:t xml:space="preserve">Not at all (1)</w:t>
+      </w:r>
+    </w:p>
+    <w:p>
+      <w:pPr>
+        <w:pStyle w:val="BodyText"/>
+      </w:pPr>
+      <w:r>
+        <w:t xml:space="preserve">Slightly (2)</w:t>
+      </w:r>
+    </w:p>
+    <w:p>
+      <w:pPr>
+        <w:pStyle w:val="BodyText"/>
+      </w:pPr>
+      <w:r>
+        <w:t xml:space="preserve">Moderately (3)</w:t>
+      </w:r>
+    </w:p>
+    <w:p>
+      <w:pPr>
+        <w:pStyle w:val="BodyText"/>
+      </w:pPr>
+      <w:r>
+        <w:t xml:space="preserve">Quite a bit (4)</w:t>
+      </w:r>
+    </w:p>
+    <w:p>
+      <w:pPr>
+        <w:pStyle w:val="BodyText"/>
+      </w:pPr>
+      <w:r>
+        <w:t xml:space="preserve">Very much (5)</w:t>
+      </w:r>
+    </w:p>
+    <w:bookmarkEnd w:id="65"/>
+    <w:p>
+      <w:pPr>
+        <w:pStyle w:val="BodyText"/>
+      </w:pPr>
+      <w:r>
+        <w:t xml:space="preserve">*</w:t>
+      </w:r>
+    </w:p>
+    <w:bookmarkEnd w:id="66"/>
+    <w:bookmarkStart w:id="68" w:name="container-ai_genomics_understanding"/>
+    <w:bookmarkStart w:id="67" w:name="ai_genomics_understanding"/>
+    <w:p>
+      <w:pPr>
+        <w:pStyle w:val="BodyText"/>
+      </w:pPr>
+      <w:r>
+        <w:t xml:space="preserve">After completing the activity, I have a better understanding of how AI is used in genomics/metagenomics research.</w:t>
+      </w:r>
+    </w:p>
+    <w:p>
+      <w:pPr>
+        <w:pStyle w:val="BodyText"/>
+      </w:pPr>
+      <w:r>
+        <w:t xml:space="preserve">Not at all (1)</w:t>
+      </w:r>
+    </w:p>
+    <w:p>
+      <w:pPr>
+        <w:pStyle w:val="BodyText"/>
+      </w:pPr>
+      <w:r>
+        <w:t xml:space="preserve">Slightly (2)</w:t>
+      </w:r>
+    </w:p>
+    <w:p>
+      <w:pPr>
+        <w:pStyle w:val="BodyText"/>
+      </w:pPr>
+      <w:r>
+        <w:t xml:space="preserve">Moderately (3)</w:t>
+      </w:r>
+    </w:p>
+    <w:p>
+      <w:pPr>
+        <w:pStyle w:val="BodyText"/>
+      </w:pPr>
+      <w:r>
+        <w:t xml:space="preserve">Quite a bit (4)</w:t>
+      </w:r>
+    </w:p>
+    <w:p>
+      <w:pPr>
+        <w:pStyle w:val="BodyText"/>
+      </w:pPr>
+      <w:r>
+        <w:t xml:space="preserve">Very much (5)</w:t>
+      </w:r>
+    </w:p>
+    <w:bookmarkEnd w:id="67"/>
+    <w:p>
+      <w:pPr>
+        <w:pStyle w:val="BodyText"/>
+      </w:pPr>
+      <w:r>
+        <w:t xml:space="preserve">*</w:t>
+      </w:r>
+    </w:p>
+    <w:bookmarkEnd w:id="68"/>
+    <w:bookmarkStart w:id="69" w:name="container-reflection_comments"/>
+    <w:p>
+      <w:pPr>
+        <w:pStyle w:val="BodyText"/>
+      </w:pPr>
+      <w:r>
+        <w:t xml:space="preserve">(Optional) In 1–2 sentences, tell us about your responses above.</w:t>
+      </w:r>
+    </w:p>
+    <w:p>
+      <w:pPr>
+        <w:pStyle w:val="BodyText"/>
+      </w:pPr>
+      <w:r>
+        <w:t xml:space="preserve">*</w:t>
+      </w:r>
+    </w:p>
+    <w:bookmarkEnd w:id="69"/>
     <w:p>
       <w:pPr>
         <w:pStyle w:val="BodyText"/>
@@ -835,915 +1730,11 @@
         <w:pStyle w:val="BodyText"/>
       </w:pPr>
       <w:r>
-        <w:t xml:space="preserve">— reflection1</w:t>
-      </w:r>
-    </w:p>
-    <w:bookmarkEnd w:id="42"/>
-    <w:bookmarkStart w:id="72" w:name="reflecting-on-your-experience"/>
-    <w:p>
-      <w:pPr>
-        <w:pStyle w:val="Heading1"/>
-      </w:pPr>
-      <w:r>
-        <w:t xml:space="preserve">Reflecting on your experience</w:t>
-      </w:r>
-    </w:p>
-    <w:p>
-      <w:pPr>
-        <w:pStyle w:val="FirstParagraph"/>
-      </w:pPr>
-      <w:r>
-        <w:t xml:space="preserve">These questions are intended to help you reflect on your experience</w:t>
-      </w:r>
-      <w:r>
-        <w:t xml:space="preserve"> </w:t>
-      </w:r>
-      <w:r>
-        <w:t xml:space="preserve">working through the AI-GENe modules. Please rate how much you agree with</w:t>
-      </w:r>
-      <w:r>
-        <w:t xml:space="preserve"> </w:t>
-      </w:r>
-      <w:r>
-        <w:t xml:space="preserve">each statement.</w:t>
-      </w:r>
-    </w:p>
-    <w:bookmarkStart w:id="44" w:name="container-lab_skills"/>
-    <w:bookmarkStart w:id="43" w:name="lab_skills"/>
-    <w:p>
-      <w:pPr>
-        <w:pStyle w:val="BodyText"/>
-      </w:pPr>
-      <w:r>
-        <w:t xml:space="preserve">After completing the activity, my skills and comfort with genetics lab work have improved.</w:t>
-      </w:r>
-    </w:p>
-    <w:p>
-      <w:pPr>
-        <w:pStyle w:val="BodyText"/>
-      </w:pPr>
-      <w:r>
-        <w:t xml:space="preserve">Not at all (1)</w:t>
-      </w:r>
-    </w:p>
-    <w:p>
-      <w:pPr>
-        <w:pStyle w:val="BodyText"/>
-      </w:pPr>
-      <w:r>
-        <w:t xml:space="preserve">Slightly (2)</w:t>
-      </w:r>
-    </w:p>
-    <w:p>
-      <w:pPr>
-        <w:pStyle w:val="BodyText"/>
-      </w:pPr>
-      <w:r>
-        <w:t xml:space="preserve">Moderately (3)</w:t>
-      </w:r>
-    </w:p>
-    <w:p>
-      <w:pPr>
-        <w:pStyle w:val="BodyText"/>
-      </w:pPr>
-      <w:r>
-        <w:t xml:space="preserve">Quite a bit (4)</w:t>
-      </w:r>
-    </w:p>
-    <w:p>
-      <w:pPr>
-        <w:pStyle w:val="BodyText"/>
-      </w:pPr>
-      <w:r>
-        <w:t xml:space="preserve">Very much (5)</w:t>
-      </w:r>
-    </w:p>
-    <w:bookmarkEnd w:id="43"/>
-    <w:p>
-      <w:pPr>
-        <w:pStyle w:val="BodyText"/>
-      </w:pPr>
-      <w:r>
-        <w:t xml:space="preserve">*</w:t>
-      </w:r>
-    </w:p>
-    <w:bookmarkEnd w:id="44"/>
-    <w:bookmarkStart w:id="46" w:name="container-data_analysis_skills"/>
-    <w:bookmarkStart w:id="45" w:name="data_analysis_skills"/>
-    <w:p>
-      <w:pPr>
-        <w:pStyle w:val="BodyText"/>
-      </w:pPr>
-      <w:r>
-        <w:t xml:space="preserve">After completing the activity, my skills and comfort with analyzing genetic data have improved.</w:t>
-      </w:r>
-    </w:p>
-    <w:p>
-      <w:pPr>
-        <w:pStyle w:val="BodyText"/>
-      </w:pPr>
-      <w:r>
-        <w:t xml:space="preserve">Not at all (1)</w:t>
-      </w:r>
-    </w:p>
-    <w:p>
-      <w:pPr>
-        <w:pStyle w:val="BodyText"/>
-      </w:pPr>
-      <w:r>
-        <w:t xml:space="preserve">Slightly (2)</w:t>
-      </w:r>
-    </w:p>
-    <w:p>
-      <w:pPr>
-        <w:pStyle w:val="BodyText"/>
-      </w:pPr>
-      <w:r>
-        <w:t xml:space="preserve">Moderately (3)</w:t>
-      </w:r>
-    </w:p>
-    <w:p>
-      <w:pPr>
-        <w:pStyle w:val="BodyText"/>
-      </w:pPr>
-      <w:r>
-        <w:t xml:space="preserve">Quite a bit (4)</w:t>
-      </w:r>
-    </w:p>
-    <w:p>
-      <w:pPr>
-        <w:pStyle w:val="BodyText"/>
-      </w:pPr>
-      <w:r>
-        <w:t xml:space="preserve">Very much (5)</w:t>
-      </w:r>
-    </w:p>
-    <w:bookmarkEnd w:id="45"/>
-    <w:p>
-      <w:pPr>
-        <w:pStyle w:val="BodyText"/>
-      </w:pPr>
-      <w:r>
-        <w:t xml:space="preserve">*</w:t>
-      </w:r>
-    </w:p>
-    <w:bookmarkEnd w:id="46"/>
-    <w:bookmarkStart w:id="48" w:name="container-genomics_tools"/>
-    <w:bookmarkStart w:id="47" w:name="genomics_tools"/>
-    <w:p>
-      <w:pPr>
-        <w:pStyle w:val="BodyText"/>
-      </w:pPr>
-      <w:r>
-        <w:t xml:space="preserve">After completing the activity, my skills and comfort with using genomics tools and/or websites have improved.</w:t>
-      </w:r>
-    </w:p>
-    <w:p>
-      <w:pPr>
-        <w:pStyle w:val="BodyText"/>
-      </w:pPr>
-      <w:r>
-        <w:t xml:space="preserve">Not at all (1)</w:t>
-      </w:r>
-    </w:p>
-    <w:p>
-      <w:pPr>
-        <w:pStyle w:val="BodyText"/>
-      </w:pPr>
-      <w:r>
-        <w:t xml:space="preserve">Slightly (2)</w:t>
-      </w:r>
-    </w:p>
-    <w:p>
-      <w:pPr>
-        <w:pStyle w:val="BodyText"/>
-      </w:pPr>
-      <w:r>
-        <w:t xml:space="preserve">Moderately (3)</w:t>
-      </w:r>
-    </w:p>
-    <w:p>
-      <w:pPr>
-        <w:pStyle w:val="BodyText"/>
-      </w:pPr>
-      <w:r>
-        <w:t xml:space="preserve">Quite a bit (4)</w:t>
-      </w:r>
-    </w:p>
-    <w:p>
-      <w:pPr>
-        <w:pStyle w:val="BodyText"/>
-      </w:pPr>
-      <w:r>
-        <w:t xml:space="preserve">Very much (5)</w:t>
-      </w:r>
-    </w:p>
-    <w:bookmarkEnd w:id="47"/>
-    <w:p>
-      <w:pPr>
-        <w:pStyle w:val="BodyText"/>
-      </w:pPr>
-      <w:r>
-        <w:t xml:space="preserve">*</w:t>
-      </w:r>
-    </w:p>
-    <w:bookmarkEnd w:id="48"/>
-    <w:bookmarkStart w:id="50" w:name="container-ai_tools"/>
-    <w:bookmarkStart w:id="49" w:name="ai_tools"/>
-    <w:p>
-      <w:pPr>
-        <w:pStyle w:val="BodyText"/>
-      </w:pPr>
-      <w:r>
-        <w:t xml:space="preserve">After completing the activity, my skills and comfort with using AI-based tools for genetics work have improved.</w:t>
-      </w:r>
-    </w:p>
-    <w:p>
-      <w:pPr>
-        <w:pStyle w:val="BodyText"/>
-      </w:pPr>
-      <w:r>
-        <w:t xml:space="preserve">Not at all (1)</w:t>
-      </w:r>
-    </w:p>
-    <w:p>
-      <w:pPr>
-        <w:pStyle w:val="BodyText"/>
-      </w:pPr>
-      <w:r>
-        <w:t xml:space="preserve">Slightly (2)</w:t>
-      </w:r>
-    </w:p>
-    <w:p>
-      <w:pPr>
-        <w:pStyle w:val="BodyText"/>
-      </w:pPr>
-      <w:r>
-        <w:t xml:space="preserve">Moderately (3)</w:t>
-      </w:r>
-    </w:p>
-    <w:p>
-      <w:pPr>
-        <w:pStyle w:val="BodyText"/>
-      </w:pPr>
-      <w:r>
-        <w:t xml:space="preserve">Quite a bit (4)</w:t>
-      </w:r>
-    </w:p>
-    <w:p>
-      <w:pPr>
-        <w:pStyle w:val="BodyText"/>
-      </w:pPr>
-      <w:r>
-        <w:t xml:space="preserve">Very much (5)</w:t>
-      </w:r>
-    </w:p>
-    <w:bookmarkEnd w:id="49"/>
-    <w:p>
-      <w:pPr>
-        <w:pStyle w:val="BodyText"/>
-      </w:pPr>
-      <w:r>
-        <w:t xml:space="preserve">*</w:t>
-      </w:r>
-    </w:p>
-    <w:bookmarkEnd w:id="50"/>
-    <w:bookmarkStart w:id="52" w:name="container-apply_skills"/>
-    <w:bookmarkStart w:id="51" w:name="apply_skills"/>
-    <w:p>
-      <w:pPr>
-        <w:pStyle w:val="BodyText"/>
-      </w:pPr>
-      <w:r>
-        <w:t xml:space="preserve">This activity made me apply my skills, rather than recall facts.</w:t>
-      </w:r>
-    </w:p>
-    <w:p>
-      <w:pPr>
-        <w:pStyle w:val="BodyText"/>
-      </w:pPr>
-      <w:r>
-        <w:t xml:space="preserve">Not at all (1)</w:t>
-      </w:r>
-    </w:p>
-    <w:p>
-      <w:pPr>
-        <w:pStyle w:val="BodyText"/>
-      </w:pPr>
-      <w:r>
-        <w:t xml:space="preserve">Slightly (2)</w:t>
-      </w:r>
-    </w:p>
-    <w:p>
-      <w:pPr>
-        <w:pStyle w:val="BodyText"/>
-      </w:pPr>
-      <w:r>
-        <w:t xml:space="preserve">Moderately (3)</w:t>
-      </w:r>
-    </w:p>
-    <w:p>
-      <w:pPr>
-        <w:pStyle w:val="BodyText"/>
-      </w:pPr>
-      <w:r>
-        <w:t xml:space="preserve">Quite a bit (4)</w:t>
-      </w:r>
-    </w:p>
-    <w:p>
-      <w:pPr>
-        <w:pStyle w:val="BodyText"/>
-      </w:pPr>
-      <w:r>
-        <w:t xml:space="preserve">Very much (5)</w:t>
-      </w:r>
-    </w:p>
-    <w:bookmarkEnd w:id="51"/>
-    <w:p>
-      <w:pPr>
-        <w:pStyle w:val="BodyText"/>
-      </w:pPr>
-      <w:r>
-        <w:t xml:space="preserve">*</w:t>
-      </w:r>
-    </w:p>
-    <w:bookmarkEnd w:id="52"/>
-    <w:bookmarkStart w:id="54" w:name="container-evaluate_evidence"/>
-    <w:bookmarkStart w:id="53" w:name="evaluate_evidence"/>
-    <w:p>
-      <w:pPr>
-        <w:pStyle w:val="BodyText"/>
-      </w:pPr>
-      <w:r>
-        <w:t xml:space="preserve">This activity made me evaluate evidence, rather than recall facts.</w:t>
-      </w:r>
-    </w:p>
-    <w:p>
-      <w:pPr>
-        <w:pStyle w:val="BodyText"/>
-      </w:pPr>
-      <w:r>
-        <w:t xml:space="preserve">Not at all (1)</w:t>
-      </w:r>
-    </w:p>
-    <w:p>
-      <w:pPr>
-        <w:pStyle w:val="BodyText"/>
-      </w:pPr>
-      <w:r>
-        <w:t xml:space="preserve">Slightly (2)</w:t>
-      </w:r>
-    </w:p>
-    <w:p>
-      <w:pPr>
-        <w:pStyle w:val="BodyText"/>
-      </w:pPr>
-      <w:r>
-        <w:t xml:space="preserve">Moderately (3)</w:t>
-      </w:r>
-    </w:p>
-    <w:p>
-      <w:pPr>
-        <w:pStyle w:val="BodyText"/>
-      </w:pPr>
-      <w:r>
-        <w:t xml:space="preserve">Quite a bit (4)</w:t>
-      </w:r>
-    </w:p>
-    <w:p>
-      <w:pPr>
-        <w:pStyle w:val="BodyText"/>
-      </w:pPr>
-      <w:r>
-        <w:t xml:space="preserve">Very much (5)</w:t>
-      </w:r>
-    </w:p>
-    <w:bookmarkEnd w:id="53"/>
-    <w:p>
-      <w:pPr>
-        <w:pStyle w:val="BodyText"/>
-      </w:pPr>
-      <w:r>
-        <w:t xml:space="preserve">*</w:t>
-      </w:r>
-    </w:p>
-    <w:bookmarkEnd w:id="54"/>
-    <w:bookmarkStart w:id="56" w:name="container-draw_conclusions"/>
-    <w:bookmarkStart w:id="55" w:name="draw_conclusions"/>
-    <w:p>
-      <w:pPr>
-        <w:pStyle w:val="BodyText"/>
-      </w:pPr>
-      <w:r>
-        <w:t xml:space="preserve">This activity helped me draw conclusions from data.</w:t>
-      </w:r>
-    </w:p>
-    <w:p>
-      <w:pPr>
-        <w:pStyle w:val="BodyText"/>
-      </w:pPr>
-      <w:r>
-        <w:t xml:space="preserve">Not at all (1)</w:t>
-      </w:r>
-    </w:p>
-    <w:p>
-      <w:pPr>
-        <w:pStyle w:val="BodyText"/>
-      </w:pPr>
-      <w:r>
-        <w:t xml:space="preserve">Slightly (2)</w:t>
-      </w:r>
-    </w:p>
-    <w:p>
-      <w:pPr>
-        <w:pStyle w:val="BodyText"/>
-      </w:pPr>
-      <w:r>
-        <w:t xml:space="preserve">Moderately (3)</w:t>
-      </w:r>
-    </w:p>
-    <w:p>
-      <w:pPr>
-        <w:pStyle w:val="BodyText"/>
-      </w:pPr>
-      <w:r>
-        <w:t xml:space="preserve">Quite a bit (4)</w:t>
-      </w:r>
-    </w:p>
-    <w:p>
-      <w:pPr>
-        <w:pStyle w:val="BodyText"/>
-      </w:pPr>
-      <w:r>
-        <w:t xml:space="preserve">Very much (5)</w:t>
-      </w:r>
-    </w:p>
-    <w:bookmarkEnd w:id="55"/>
-    <w:p>
-      <w:pPr>
-        <w:pStyle w:val="BodyText"/>
-      </w:pPr>
-      <w:r>
-        <w:t xml:space="preserve">*</w:t>
-      </w:r>
-    </w:p>
-    <w:bookmarkEnd w:id="56"/>
-    <w:bookmarkStart w:id="58" w:name="container-real_science"/>
-    <w:bookmarkStart w:id="57" w:name="real_science"/>
-    <w:p>
-      <w:pPr>
-        <w:pStyle w:val="BodyText"/>
-      </w:pPr>
-      <w:r>
-        <w:t xml:space="preserve">This activity allowed me to do “real science.”</w:t>
-      </w:r>
-    </w:p>
-    <w:p>
-      <w:pPr>
-        <w:pStyle w:val="BodyText"/>
-      </w:pPr>
-      <w:r>
-        <w:t xml:space="preserve">Not at all (1)</w:t>
-      </w:r>
-    </w:p>
-    <w:p>
-      <w:pPr>
-        <w:pStyle w:val="BodyText"/>
-      </w:pPr>
-      <w:r>
-        <w:t xml:space="preserve">Slightly (2)</w:t>
-      </w:r>
-    </w:p>
-    <w:p>
-      <w:pPr>
-        <w:pStyle w:val="BodyText"/>
-      </w:pPr>
-      <w:r>
-        <w:t xml:space="preserve">Moderately (3)</w:t>
-      </w:r>
-    </w:p>
-    <w:p>
-      <w:pPr>
-        <w:pStyle w:val="BodyText"/>
-      </w:pPr>
-      <w:r>
-        <w:t xml:space="preserve">Quite a bit (4)</w:t>
-      </w:r>
-    </w:p>
-    <w:p>
-      <w:pPr>
-        <w:pStyle w:val="BodyText"/>
-      </w:pPr>
-      <w:r>
-        <w:t xml:space="preserve">Very much (5)</w:t>
-      </w:r>
-    </w:p>
-    <w:bookmarkEnd w:id="57"/>
-    <w:p>
-      <w:pPr>
-        <w:pStyle w:val="BodyText"/>
-      </w:pPr>
-      <w:r>
-        <w:t xml:space="preserve">*</w:t>
-      </w:r>
-    </w:p>
-    <w:bookmarkEnd w:id="58"/>
-    <w:bookmarkStart w:id="60" w:name="container-stem_interest"/>
-    <w:bookmarkStart w:id="59" w:name="stem_interest"/>
-    <w:p>
-      <w:pPr>
-        <w:pStyle w:val="BodyText"/>
-      </w:pPr>
-      <w:r>
-        <w:t xml:space="preserve">After completing the activity, I have more interest in STEM careers.</w:t>
-      </w:r>
-    </w:p>
-    <w:p>
-      <w:pPr>
-        <w:pStyle w:val="BodyText"/>
-      </w:pPr>
-      <w:r>
-        <w:t xml:space="preserve">Not at all (1)</w:t>
-      </w:r>
-    </w:p>
-    <w:p>
-      <w:pPr>
-        <w:pStyle w:val="BodyText"/>
-      </w:pPr>
-      <w:r>
-        <w:t xml:space="preserve">Slightly (2)</w:t>
-      </w:r>
-    </w:p>
-    <w:p>
-      <w:pPr>
-        <w:pStyle w:val="BodyText"/>
-      </w:pPr>
-      <w:r>
-        <w:t xml:space="preserve">Moderately (3)</w:t>
-      </w:r>
-    </w:p>
-    <w:p>
-      <w:pPr>
-        <w:pStyle w:val="BodyText"/>
-      </w:pPr>
-      <w:r>
-        <w:t xml:space="preserve">Quite a bit (4)</w:t>
-      </w:r>
-    </w:p>
-    <w:p>
-      <w:pPr>
-        <w:pStyle w:val="BodyText"/>
-      </w:pPr>
-      <w:r>
-        <w:t xml:space="preserve">Very much (5)</w:t>
-      </w:r>
-    </w:p>
-    <w:bookmarkEnd w:id="59"/>
-    <w:p>
-      <w:pPr>
-        <w:pStyle w:val="BodyText"/>
-      </w:pPr>
-      <w:r>
-        <w:t xml:space="preserve">*</w:t>
-      </w:r>
-    </w:p>
-    <w:bookmarkEnd w:id="60"/>
-    <w:bookmarkStart w:id="62" w:name="container-metagenomics_knowledge"/>
-    <w:bookmarkStart w:id="61" w:name="metagenomics_knowledge"/>
-    <w:p>
-      <w:pPr>
-        <w:pStyle w:val="BodyText"/>
-      </w:pPr>
-      <w:r>
-        <w:t xml:space="preserve">After completing the activity, I am more knowledgeable about how metagenomics research happens.</w:t>
-      </w:r>
-    </w:p>
-    <w:p>
-      <w:pPr>
-        <w:pStyle w:val="BodyText"/>
-      </w:pPr>
-      <w:r>
-        <w:t xml:space="preserve">Not at all (1)</w:t>
-      </w:r>
-    </w:p>
-    <w:p>
-      <w:pPr>
-        <w:pStyle w:val="BodyText"/>
-      </w:pPr>
-      <w:r>
-        <w:t xml:space="preserve">Slightly (2)</w:t>
-      </w:r>
-    </w:p>
-    <w:p>
-      <w:pPr>
-        <w:pStyle w:val="BodyText"/>
-      </w:pPr>
-      <w:r>
-        <w:t xml:space="preserve">Moderately (3)</w:t>
-      </w:r>
-    </w:p>
-    <w:p>
-      <w:pPr>
-        <w:pStyle w:val="BodyText"/>
-      </w:pPr>
-      <w:r>
-        <w:t xml:space="preserve">Quite a bit (4)</w:t>
-      </w:r>
-    </w:p>
-    <w:p>
-      <w:pPr>
-        <w:pStyle w:val="BodyText"/>
-      </w:pPr>
-      <w:r>
-        <w:t xml:space="preserve">Very much (5)</w:t>
-      </w:r>
-    </w:p>
-    <w:bookmarkEnd w:id="61"/>
-    <w:p>
-      <w:pPr>
-        <w:pStyle w:val="BodyText"/>
-      </w:pPr>
-      <w:r>
-        <w:t xml:space="preserve">*</w:t>
-      </w:r>
-    </w:p>
-    <w:bookmarkEnd w:id="62"/>
-    <w:bookmarkStart w:id="64" w:name="container-ai_models_knowledge"/>
-    <w:bookmarkStart w:id="63" w:name="ai_models_knowledge"/>
-    <w:p>
-      <w:pPr>
-        <w:pStyle w:val="BodyText"/>
-      </w:pPr>
-      <w:r>
-        <w:t xml:space="preserve">After completing the activity, I am more knowledgeable about how AI models work.</w:t>
-      </w:r>
-    </w:p>
-    <w:p>
-      <w:pPr>
-        <w:pStyle w:val="BodyText"/>
-      </w:pPr>
-      <w:r>
-        <w:t xml:space="preserve">Not at all (1)</w:t>
-      </w:r>
-    </w:p>
-    <w:p>
-      <w:pPr>
-        <w:pStyle w:val="BodyText"/>
-      </w:pPr>
-      <w:r>
-        <w:t xml:space="preserve">Slightly (2)</w:t>
-      </w:r>
-    </w:p>
-    <w:p>
-      <w:pPr>
-        <w:pStyle w:val="BodyText"/>
-      </w:pPr>
-      <w:r>
-        <w:t xml:space="preserve">Moderately (3)</w:t>
-      </w:r>
-    </w:p>
-    <w:p>
-      <w:pPr>
-        <w:pStyle w:val="BodyText"/>
-      </w:pPr>
-      <w:r>
-        <w:t xml:space="preserve">Quite a bit (4)</w:t>
-      </w:r>
-    </w:p>
-    <w:p>
-      <w:pPr>
-        <w:pStyle w:val="BodyText"/>
-      </w:pPr>
-      <w:r>
-        <w:t xml:space="preserve">Very much (5)</w:t>
-      </w:r>
-    </w:p>
-    <w:bookmarkEnd w:id="63"/>
-    <w:p>
-      <w:pPr>
-        <w:pStyle w:val="BodyText"/>
-      </w:pPr>
-      <w:r>
-        <w:t xml:space="preserve">*</w:t>
-      </w:r>
-    </w:p>
-    <w:bookmarkEnd w:id="64"/>
-    <w:bookmarkStart w:id="66" w:name="container-genomics_curiosity"/>
-    <w:bookmarkStart w:id="65" w:name="genomics_curiosity"/>
-    <w:p>
-      <w:pPr>
-        <w:pStyle w:val="BodyText"/>
-      </w:pPr>
-      <w:r>
-        <w:t xml:space="preserve">After completing the activity, I am more curious about genomics/metagenomics/genetics.</w:t>
-      </w:r>
-    </w:p>
-    <w:p>
-      <w:pPr>
-        <w:pStyle w:val="BodyText"/>
-      </w:pPr>
-      <w:r>
-        <w:t xml:space="preserve">Not at all (1)</w:t>
-      </w:r>
-    </w:p>
-    <w:p>
-      <w:pPr>
-        <w:pStyle w:val="BodyText"/>
-      </w:pPr>
-      <w:r>
-        <w:t xml:space="preserve">Slightly (2)</w:t>
-      </w:r>
-    </w:p>
-    <w:p>
-      <w:pPr>
-        <w:pStyle w:val="BodyText"/>
-      </w:pPr>
-      <w:r>
-        <w:t xml:space="preserve">Moderately (3)</w:t>
-      </w:r>
-    </w:p>
-    <w:p>
-      <w:pPr>
-        <w:pStyle w:val="BodyText"/>
-      </w:pPr>
-      <w:r>
-        <w:t xml:space="preserve">Quite a bit (4)</w:t>
-      </w:r>
-    </w:p>
-    <w:p>
-      <w:pPr>
-        <w:pStyle w:val="BodyText"/>
-      </w:pPr>
-      <w:r>
-        <w:t xml:space="preserve">Very much (5)</w:t>
-      </w:r>
-    </w:p>
-    <w:bookmarkEnd w:id="65"/>
-    <w:p>
-      <w:pPr>
-        <w:pStyle w:val="BodyText"/>
-      </w:pPr>
-      <w:r>
-        <w:t xml:space="preserve">*</w:t>
-      </w:r>
-    </w:p>
-    <w:bookmarkEnd w:id="66"/>
-    <w:bookmarkStart w:id="68" w:name="container-learn_more_genomics"/>
-    <w:bookmarkStart w:id="67" w:name="learn_more_genomics"/>
-    <w:p>
-      <w:pPr>
-        <w:pStyle w:val="BodyText"/>
-      </w:pPr>
-      <w:r>
-        <w:t xml:space="preserve">After completing the activity, I want to learn more about genomics/genetics.</w:t>
-      </w:r>
-    </w:p>
-    <w:p>
-      <w:pPr>
-        <w:pStyle w:val="BodyText"/>
-      </w:pPr>
-      <w:r>
-        <w:t xml:space="preserve">Not at all (1)</w:t>
-      </w:r>
-    </w:p>
-    <w:p>
-      <w:pPr>
-        <w:pStyle w:val="BodyText"/>
-      </w:pPr>
-      <w:r>
-        <w:t xml:space="preserve">Slightly (2)</w:t>
-      </w:r>
-    </w:p>
-    <w:p>
-      <w:pPr>
-        <w:pStyle w:val="BodyText"/>
-      </w:pPr>
-      <w:r>
-        <w:t xml:space="preserve">Moderately (3)</w:t>
-      </w:r>
-    </w:p>
-    <w:p>
-      <w:pPr>
-        <w:pStyle w:val="BodyText"/>
-      </w:pPr>
-      <w:r>
-        <w:t xml:space="preserve">Quite a bit (4)</w:t>
-      </w:r>
-    </w:p>
-    <w:p>
-      <w:pPr>
-        <w:pStyle w:val="BodyText"/>
-      </w:pPr>
-      <w:r>
-        <w:t xml:space="preserve">Very much (5)</w:t>
-      </w:r>
-    </w:p>
-    <w:bookmarkEnd w:id="67"/>
-    <w:p>
-      <w:pPr>
-        <w:pStyle w:val="BodyText"/>
-      </w:pPr>
-      <w:r>
-        <w:t xml:space="preserve">*</w:t>
-      </w:r>
-    </w:p>
-    <w:bookmarkEnd w:id="68"/>
-    <w:bookmarkStart w:id="70" w:name="container-ai_genomics_understanding"/>
-    <w:bookmarkStart w:id="69" w:name="ai_genomics_understanding"/>
-    <w:p>
-      <w:pPr>
-        <w:pStyle w:val="BodyText"/>
-      </w:pPr>
-      <w:r>
-        <w:t xml:space="preserve">After completing the activity, I have a better understanding of how AI is used in genomics/metagenomics research.</w:t>
-      </w:r>
-    </w:p>
-    <w:p>
-      <w:pPr>
-        <w:pStyle w:val="BodyText"/>
-      </w:pPr>
-      <w:r>
-        <w:t xml:space="preserve">Not at all (1)</w:t>
-      </w:r>
-    </w:p>
-    <w:p>
-      <w:pPr>
-        <w:pStyle w:val="BodyText"/>
-      </w:pPr>
-      <w:r>
-        <w:t xml:space="preserve">Slightly (2)</w:t>
-      </w:r>
-    </w:p>
-    <w:p>
-      <w:pPr>
-        <w:pStyle w:val="BodyText"/>
-      </w:pPr>
-      <w:r>
-        <w:t xml:space="preserve">Moderately (3)</w:t>
-      </w:r>
-    </w:p>
-    <w:p>
-      <w:pPr>
-        <w:pStyle w:val="BodyText"/>
-      </w:pPr>
-      <w:r>
-        <w:t xml:space="preserve">Quite a bit (4)</w:t>
-      </w:r>
-    </w:p>
-    <w:p>
-      <w:pPr>
-        <w:pStyle w:val="BodyText"/>
-      </w:pPr>
-      <w:r>
-        <w:t xml:space="preserve">Very much (5)</w:t>
-      </w:r>
-    </w:p>
-    <w:bookmarkEnd w:id="69"/>
-    <w:p>
-      <w:pPr>
-        <w:pStyle w:val="BodyText"/>
-      </w:pPr>
-      <w:r>
-        <w:t xml:space="preserve">*</w:t>
+        <w:t xml:space="preserve">— openended</w:t>
       </w:r>
     </w:p>
     <w:bookmarkEnd w:id="70"/>
-    <w:bookmarkStart w:id="71" w:name="container-reflection_comments"/>
-    <w:p>
-      <w:pPr>
-        <w:pStyle w:val="BodyText"/>
-      </w:pPr>
-      <w:r>
-        <w:t xml:space="preserve">(Optional) In 1–2 sentences, tell us about your responses above.</w:t>
-      </w:r>
-    </w:p>
-    <w:p>
-      <w:pPr>
-        <w:pStyle w:val="BodyText"/>
-      </w:pPr>
-      <w:r>
-        <w:t xml:space="preserve">*</w:t>
-      </w:r>
-    </w:p>
-    <w:bookmarkEnd w:id="71"/>
-    <w:p>
-      <w:pPr>
-        <w:pStyle w:val="BodyText"/>
-      </w:pPr>
-      <w:r>
-        <w:br/>
-      </w:r>
-    </w:p>
-    <w:p>
-      <w:pPr>
-        <w:pStyle w:val="BodyText"/>
-      </w:pPr>
-      <w:r>
-        <w:t xml:space="preserve">— openended</w:t>
-      </w:r>
-    </w:p>
-    <w:bookmarkEnd w:id="72"/>
-    <w:bookmarkStart w:id="77" w:name="additional-reflections"/>
+    <w:bookmarkStart w:id="75" w:name="additional-reflections"/>
     <w:p>
       <w:pPr>
         <w:pStyle w:val="Heading1"/>
@@ -1786,7 +1777,7 @@
         <w:t xml:space="preserve">other identifying information in your responses.</w:t>
       </w:r>
     </w:p>
-    <w:bookmarkStart w:id="73" w:name="container-knowledge_gained"/>
+    <w:bookmarkStart w:id="71" w:name="container-knowledge_gained"/>
     <w:p>
       <w:pPr>
         <w:pStyle w:val="BodyText"/>
@@ -1803,14 +1794,50 @@
         <w:t xml:space="preserve">*</w:t>
       </w:r>
     </w:p>
+    <w:bookmarkEnd w:id="71"/>
+    <w:bookmarkStart w:id="72" w:name="container-engaging_parts"/>
+    <w:p>
+      <w:pPr>
+        <w:pStyle w:val="BodyText"/>
+      </w:pPr>
+      <w:r>
+        <w:t xml:space="preserve">(Optional) Were any parts of the activity particularly engaging? If so, please describe.</w:t>
+      </w:r>
+    </w:p>
+    <w:p>
+      <w:pPr>
+        <w:pStyle w:val="BodyText"/>
+      </w:pPr>
+      <w:r>
+        <w:t xml:space="preserve">*</w:t>
+      </w:r>
+    </w:p>
+    <w:bookmarkEnd w:id="72"/>
+    <w:bookmarkStart w:id="73" w:name="container-confusing_parts"/>
+    <w:p>
+      <w:pPr>
+        <w:pStyle w:val="BodyText"/>
+      </w:pPr>
+      <w:r>
+        <w:t xml:space="preserve">(Optional) Did you find any parts of the activity confusing? If so, please describe.</w:t>
+      </w:r>
+    </w:p>
+    <w:p>
+      <w:pPr>
+        <w:pStyle w:val="BodyText"/>
+      </w:pPr>
+      <w:r>
+        <w:t xml:space="preserve">*</w:t>
+      </w:r>
+    </w:p>
     <w:bookmarkEnd w:id="73"/>
-    <w:bookmarkStart w:id="74" w:name="container-engaging_parts"/>
-    <w:p>
-      <w:pPr>
-        <w:pStyle w:val="BodyText"/>
-      </w:pPr>
-      <w:r>
-        <w:t xml:space="preserve">(Optional) Were any parts of the activity particularly engaging? If so, please describe.</w:t>
+    <w:bookmarkStart w:id="74" w:name="container-improvement_suggestions"/>
+    <w:p>
+      <w:pPr>
+        <w:pStyle w:val="BodyText"/>
+      </w:pPr>
+      <w:r>
+        <w:t xml:space="preserve">(Optional) What suggestions, if any, do you have for lesson improvement?</w:t>
       </w:r>
     </w:p>
     <w:p>
@@ -1822,42 +1849,6 @@
       </w:r>
     </w:p>
     <w:bookmarkEnd w:id="74"/>
-    <w:bookmarkStart w:id="75" w:name="container-confusing_parts"/>
-    <w:p>
-      <w:pPr>
-        <w:pStyle w:val="BodyText"/>
-      </w:pPr>
-      <w:r>
-        <w:t xml:space="preserve">(Optional) Did you find any parts of the activity confusing? If so, please describe.</w:t>
-      </w:r>
-    </w:p>
-    <w:p>
-      <w:pPr>
-        <w:pStyle w:val="BodyText"/>
-      </w:pPr>
-      <w:r>
-        <w:t xml:space="preserve">*</w:t>
-      </w:r>
-    </w:p>
-    <w:bookmarkEnd w:id="75"/>
-    <w:bookmarkStart w:id="76" w:name="container-improvement_suggestions"/>
-    <w:p>
-      <w:pPr>
-        <w:pStyle w:val="BodyText"/>
-      </w:pPr>
-      <w:r>
-        <w:t xml:space="preserve">(Optional) What suggestions, if any, do you have for lesson improvement?</w:t>
-      </w:r>
-    </w:p>
-    <w:p>
-      <w:pPr>
-        <w:pStyle w:val="BodyText"/>
-      </w:pPr>
-      <w:r>
-        <w:t xml:space="preserve">*</w:t>
-      </w:r>
-    </w:p>
-    <w:bookmarkEnd w:id="76"/>
     <w:p>
       <w:pPr>
         <w:pStyle w:val="BodyText"/>
@@ -1980,7 +1971,7 @@
         <w:t xml:space="preserve">Exit Survey</w:t>
       </w:r>
     </w:p>
-    <w:bookmarkEnd w:id="77"/>
+    <w:bookmarkEnd w:id="75"/>
     <w:sectPr/>
   </w:body>
 </w:document>

</xml_diff>

<commit_message>
Remove warning about version
</commit_message>
<xml_diff>
--- a/02 - Student Pre Post Retrospective/02_Student_Pre_Post_Retrospective.docx
+++ b/02 - Student Pre Post Retrospective/02_Student_Pre_Post_Retrospective.docx
@@ -40,17 +40,6 @@
     </w:p>
     <w:bookmarkEnd w:id="20"/>
     <w:bookmarkEnd w:id="21"/>
-    <w:p>
-      <w:pPr>
-        <w:pStyle w:val="SourceCode"/>
-      </w:pPr>
-      <w:r>
-        <w:rPr>
-          <w:rStyle w:val="VerbatimChar"/>
-        </w:rPr>
-        <w:t xml:space="preserve">## Warning: package 'surveydown' was built under R version 4.6.1</w:t>
-      </w:r>
-    </w:p>
     <w:p>
       <w:pPr>
         <w:pStyle w:val="FirstParagraph"/>

</xml_diff>